<commit_message>
Verify and correct theory paper v2 references
Checked all 39 references against OpenAlex, proceedings sites, and
arXiv. Fix the Zhao et al. (2021) author initial, add the published
venue for Bang et al. (2023) and pages for Azaria & Mitchell (2023),
and align the claims attributed to Orgad, Kapoor, Kadavath, and PopQA
with what the sources state. Log the check in the program changelog.
</commit_message>
<xml_diff>
--- a/TCL-Theory-Paper-v2.docx
+++ b/TCL-Theory-Paper-v2.docx
@@ -683,7 +683,7 @@
         <w:t xml:space="preserve"> </w:t>
       </w:r>
       <w:r>
-        <w:t xml:space="preserve">Azaria and Mitchell (2023) trained classifiers on hidden states to detect false statements. Burns et al. (2023) found truth-like directions without supervision. Marks and Tegmark (2024) found linear structure separating true and false statements. Li et al. (2023) intervened along such directions at inference time. Orgad et al. (2025) showed that correctness signal is concentrated in specific answer tokens and that probes generalize poorly across tasks. Kossen et al. (2024) trained probes to predict semantic entropy. This literature establishes the premise that TCL-v0 replicates.</w:t>
+        <w:t xml:space="preserve">Azaria and Mitchell (2023) trained classifiers on hidden states to detect false statements. Burns et al. (2023) found truth-like directions without supervision. Marks and Tegmark (2024) found linear structure separating true and false statements. Li et al. (2023) intervened along such directions at inference time. Orgad et al. (2025) showed that correctness signal is concentrated in specific answer tokens and that error detectors built on hidden states fail to generalize across datasets. Kossen et al. (2024) trained probes to predict semantic entropy. This literature establishes the premise that TCL-v0 replicates.</w:t>
       </w:r>
     </w:p>
     <w:p>
@@ -701,7 +701,7 @@
         <w:t xml:space="preserve"> </w:t>
       </w:r>
       <w:r>
-        <w:t xml:space="preserve">Kapoor et al. (2024) report that fine-tuning on a modest set of graded examples, including with LoRA, gives better uncertainty estimates than prompting or frozen probes. This is the closest prior work to TCL’s central hypothesis.</w:t>
+        <w:t xml:space="preserve">Kapoor et al. (2024) argue that prompting alone is insufficient for good calibration and that training through a model’s features is necessary. They report that fine-tuning on about a thousand graded examples, made tractable with LoRA, gives uncertainty estimates that generalize well. This is the closest prior work to TCL’s central hypothesis.</w:t>
       </w:r>
     </w:p>
     <w:p>
@@ -2511,7 +2511,7 @@
         <w:t xml:space="preserve"> </w:t>
       </w:r>
       <w:r>
-        <w:t xml:space="preserve">For PopQA (Mallen et al., 2023), each question’s subject entity has a Wikipedia page-view count. The label is the rank-normalized log page-view count, in</w:t>
+        <w:t xml:space="preserve">For PopQA (Mallen et al., 2023), each question’s subject entity has a popularity value measured by monthly Wikipedia page views. The label is the rank-normalized log page-view count, in</w:t>
       </w:r>
       <w:r>
         <w:t xml:space="preserve"> </w:t>
@@ -4469,7 +4469,7 @@
         <w:t xml:space="preserve"> </w:t>
       </w:r>
       <w:r>
-        <w:t xml:space="preserve">The trust head may learn correlations between dataset artifacts and labels rather than general reliability. Cross-dataset transfer (H2) and non-QA evaluation (H5) are designed to detect this. Orgad et al. (2025) already report poor cross-task transfer for frozen probes, so this threat is real.</w:t>
+        <w:t xml:space="preserve">The trust head may learn correlations between dataset artifacts and labels rather than general reliability. Cross-dataset transfer (H2) and non-QA evaluation (H5) are designed to detect this. Orgad et al. (2025) already report that hidden-state error detectors fail to generalize across datasets, so this threat is real.</w:t>
       </w:r>
     </w:p>
     <w:p>
@@ -4541,7 +4541,7 @@
         <w:t xml:space="preserve"> </w:t>
       </w:r>
       <w:r>
-        <w:t xml:space="preserve">Initial experiments use models of 0.5B-4B parameters. Results may not hold at larger scales, where calibration properties are known to differ (Kadavath et al., 2022).</w:t>
+        <w:t xml:space="preserve">Initial experiments use models of 0.5B-4B parameters. Results may not hold at larger scales: Kadavath et al. (2022) find that larger models are well calibrated on some question formats, so calibration behavior depends on both scale and format.</w:t>
       </w:r>
     </w:p>
     <w:p>
@@ -4605,10 +4605,10 @@
           <w:i/>
           <w:iCs/>
         </w:rPr>
-        <w:t xml:space="preserve">Findings of EMNLP</w:t>
-      </w:r>
-      <w:r>
-        <w:t xml:space="preserve">.</w:t>
+        <w:t xml:space="preserve">Findings of the Association for Computational Linguistics: EMNLP 2023</w:t>
+      </w:r>
+      <w:r>
+        <w:t xml:space="preserve">, 967-976.</w:t>
       </w:r>
     </w:p>
     <w:p>
@@ -4645,15 +4645,7 @@
         <w:pStyle w:val="BodyText"/>
       </w:pPr>
       <w:r>
-        <w:t xml:space="preserve">[4] Bang, Y., et al. (2023). A multitask, multilingual, multimodal evaluation of ChatGPT on reasoning, hallucination, and interactivity. arXiv:2302.04023.</w:t>
-      </w:r>
-    </w:p>
-    <w:p>
-      <w:pPr>
-        <w:pStyle w:val="BodyText"/>
-      </w:pPr>
-      <w:r>
-        <w:t xml:space="preserve">[5] Burns, C., Ye, H., Klein, D., &amp; Steinhardt, J. (2023). Discovering latent knowledge in language models without supervision. In</w:t>
+        <w:t xml:space="preserve">[4] Bang, Y., et al. (2023). A multitask, multilingual, multimodal evaluation of ChatGPT on reasoning, hallucination, and interactivity. In</w:t>
       </w:r>
       <w:r>
         <w:t xml:space="preserve"> </w:t>
@@ -4663,10 +4655,10 @@
           <w:i/>
           <w:iCs/>
         </w:rPr>
-        <w:t xml:space="preserve">ICLR</w:t>
-      </w:r>
-      <w:r>
-        <w:t xml:space="preserve">.</w:t>
+        <w:t xml:space="preserve">Proceedings of IJCNLP-AACL 2023</w:t>
+      </w:r>
+      <w:r>
+        <w:t xml:space="preserve">, 675-718.</w:t>
       </w:r>
     </w:p>
     <w:p>
@@ -4674,15 +4666,7 @@
         <w:pStyle w:val="BodyText"/>
       </w:pPr>
       <w:r>
-        <w:t xml:space="preserve">[6] Cobbe, K., et al. (2021). Training verifiers to solve math word problems. arXiv:2110.14168.</w:t>
-      </w:r>
-    </w:p>
-    <w:p>
-      <w:pPr>
-        <w:pStyle w:val="BodyText"/>
-      </w:pPr>
-      <w:r>
-        <w:t xml:space="preserve">[7] El-Yaniv, R., &amp; Wiener, Y. (2010). On the foundations of noise-free selective classification.</w:t>
+        <w:t xml:space="preserve">[5] Burns, C., Ye, H., Klein, D., &amp; Steinhardt, J. (2023). Discovering latent knowledge in language models without supervision. In</w:t>
       </w:r>
       <w:r>
         <w:t xml:space="preserve"> </w:t>
@@ -4692,10 +4676,10 @@
           <w:i/>
           <w:iCs/>
         </w:rPr>
-        <w:t xml:space="preserve">Journal of Machine Learning Research</w:t>
-      </w:r>
-      <w:r>
-        <w:t xml:space="preserve">, 11, 1605-1641.</w:t>
+        <w:t xml:space="preserve">ICLR</w:t>
+      </w:r>
+      <w:r>
+        <w:t xml:space="preserve">.</w:t>
       </w:r>
     </w:p>
     <w:p>
@@ -4703,7 +4687,15 @@
         <w:pStyle w:val="BodyText"/>
       </w:pPr>
       <w:r>
-        <w:t xml:space="preserve">[8] Farquhar, S., Kossen, J., Kuhn, L., &amp; Gal, Y. (2024). Detecting hallucinations in large language models using semantic entropy.</w:t>
+        <w:t xml:space="preserve">[6] Cobbe, K., et al. (2021). Training verifiers to solve math word problems. arXiv:2110.14168.</w:t>
+      </w:r>
+    </w:p>
+    <w:p>
+      <w:pPr>
+        <w:pStyle w:val="BodyText"/>
+      </w:pPr>
+      <w:r>
+        <w:t xml:space="preserve">[7] El-Yaniv, R., &amp; Wiener, Y. (2010). On the foundations of noise-free selective classification.</w:t>
       </w:r>
       <w:r>
         <w:t xml:space="preserve"> </w:t>
@@ -4713,10 +4705,10 @@
           <w:i/>
           <w:iCs/>
         </w:rPr>
-        <w:t xml:space="preserve">Nature</w:t>
-      </w:r>
-      <w:r>
-        <w:t xml:space="preserve">, 630, 625-630.</w:t>
+        <w:t xml:space="preserve">Journal of Machine Learning Research</w:t>
+      </w:r>
+      <w:r>
+        <w:t xml:space="preserve">, 11, 1605-1641.</w:t>
       </w:r>
     </w:p>
     <w:p>
@@ -4724,7 +4716,7 @@
         <w:pStyle w:val="BodyText"/>
       </w:pPr>
       <w:r>
-        <w:t xml:space="preserve">[9] Gal, Y., &amp; Ghahramani, Z. (2016). Dropout as a Bayesian approximation: Representing model uncertainty in deep learning. In</w:t>
+        <w:t xml:space="preserve">[8] Farquhar, S., Kossen, J., Kuhn, L., &amp; Gal, Y. (2024). Detecting hallucinations in large language models using semantic entropy.</w:t>
       </w:r>
       <w:r>
         <w:t xml:space="preserve"> </w:t>
@@ -4734,10 +4726,10 @@
           <w:i/>
           <w:iCs/>
         </w:rPr>
-        <w:t xml:space="preserve">ICML</w:t>
-      </w:r>
-      <w:r>
-        <w:t xml:space="preserve">.</w:t>
+        <w:t xml:space="preserve">Nature</w:t>
+      </w:r>
+      <w:r>
+        <w:t xml:space="preserve">, 630, 625-630.</w:t>
       </w:r>
     </w:p>
     <w:p>
@@ -4745,7 +4737,7 @@
         <w:pStyle w:val="BodyText"/>
       </w:pPr>
       <w:r>
-        <w:t xml:space="preserve">[10] Geifman, Y., &amp; El-Yaniv, R. (2017). Selective classification for deep neural networks. In</w:t>
+        <w:t xml:space="preserve">[9] Gal, Y., &amp; Ghahramani, Z. (2016). Dropout as a Bayesian approximation: Representing model uncertainty in deep learning. In</w:t>
       </w:r>
       <w:r>
         <w:t xml:space="preserve"> </w:t>
@@ -4755,7 +4747,7 @@
           <w:i/>
           <w:iCs/>
         </w:rPr>
-        <w:t xml:space="preserve">NeurIPS</w:t>
+        <w:t xml:space="preserve">ICML</w:t>
       </w:r>
       <w:r>
         <w:t xml:space="preserve">.</w:t>
@@ -4766,7 +4758,7 @@
         <w:pStyle w:val="BodyText"/>
       </w:pPr>
       <w:r>
-        <w:t xml:space="preserve">[11] Gneiting, T., &amp; Raftery, A. E. (2007). Strictly proper scoring rules, prediction, and estimation.</w:t>
+        <w:t xml:space="preserve">[10] Geifman, Y., &amp; El-Yaniv, R. (2017). Selective classification for deep neural networks. In</w:t>
       </w:r>
       <w:r>
         <w:t xml:space="preserve"> </w:t>
@@ -4776,10 +4768,10 @@
           <w:i/>
           <w:iCs/>
         </w:rPr>
-        <w:t xml:space="preserve">Journal of the American Statistical Association</w:t>
-      </w:r>
-      <w:r>
-        <w:t xml:space="preserve">, 102(477), 359-378.</w:t>
+        <w:t xml:space="preserve">NeurIPS</w:t>
+      </w:r>
+      <w:r>
+        <w:t xml:space="preserve">.</w:t>
       </w:r>
     </w:p>
     <w:p>
@@ -4787,7 +4779,7 @@
         <w:pStyle w:val="BodyText"/>
       </w:pPr>
       <w:r>
-        <w:t xml:space="preserve">[12] Guo, C., Pleiss, G., Sun, Y., &amp; Weinberger, K. Q. (2017). On calibration of modern neural networks. In</w:t>
+        <w:t xml:space="preserve">[11] Gneiting, T., &amp; Raftery, A. E. (2007). Strictly proper scoring rules, prediction, and estimation.</w:t>
       </w:r>
       <w:r>
         <w:t xml:space="preserve"> </w:t>
@@ -4797,10 +4789,10 @@
           <w:i/>
           <w:iCs/>
         </w:rPr>
-        <w:t xml:space="preserve">ICML</w:t>
-      </w:r>
-      <w:r>
-        <w:t xml:space="preserve">.</w:t>
+        <w:t xml:space="preserve">Journal of the American Statistical Association</w:t>
+      </w:r>
+      <w:r>
+        <w:t xml:space="preserve">, 102(477), 359-378.</w:t>
       </w:r>
     </w:p>
     <w:p>
@@ -4808,7 +4800,7 @@
         <w:pStyle w:val="BodyText"/>
       </w:pPr>
       <w:r>
-        <w:t xml:space="preserve">[13] Hu, E. J., et al. (2022). LoRA: Low-rank adaptation of large language models. In</w:t>
+        <w:t xml:space="preserve">[12] Guo, C., Pleiss, G., Sun, Y., &amp; Weinberger, K. Q. (2017). On calibration of modern neural networks. In</w:t>
       </w:r>
       <w:r>
         <w:t xml:space="preserve"> </w:t>
@@ -4818,7 +4810,7 @@
           <w:i/>
           <w:iCs/>
         </w:rPr>
-        <w:t xml:space="preserve">ICLR</w:t>
+        <w:t xml:space="preserve">ICML</w:t>
       </w:r>
       <w:r>
         <w:t xml:space="preserve">.</w:t>
@@ -4829,7 +4821,7 @@
         <w:pStyle w:val="BodyText"/>
       </w:pPr>
       <w:r>
-        <w:t xml:space="preserve">[14] Joshi, M., Choi, E., Weld, D., &amp; Zettlemoyer, L. (2017). TriviaQA: A large scale distantly supervised challenge dataset for reading comprehension. In</w:t>
+        <w:t xml:space="preserve">[13] Hu, E. J., et al. (2022). LoRA: Low-rank adaptation of large language models. In</w:t>
       </w:r>
       <w:r>
         <w:t xml:space="preserve"> </w:t>
@@ -4839,7 +4831,7 @@
           <w:i/>
           <w:iCs/>
         </w:rPr>
-        <w:t xml:space="preserve">ACL</w:t>
+        <w:t xml:space="preserve">ICLR</w:t>
       </w:r>
       <w:r>
         <w:t xml:space="preserve">.</w:t>
@@ -4850,15 +4842,7 @@
         <w:pStyle w:val="BodyText"/>
       </w:pPr>
       <w:r>
-        <w:t xml:space="preserve">[15] Kadavath, S., et al. (2022). Language models (mostly) know what they know. arXiv:2207.05221.</w:t>
-      </w:r>
-    </w:p>
-    <w:p>
-      <w:pPr>
-        <w:pStyle w:val="BodyText"/>
-      </w:pPr>
-      <w:r>
-        <w:t xml:space="preserve">[16] Kandpal, N., Deng, H., Roberts, A., Wallace, E., &amp; Raffel, C. (2023). Large language models struggle to learn long-tail knowledge. In</w:t>
+        <w:t xml:space="preserve">[14] Joshi, M., Choi, E., Weld, D., &amp; Zettlemoyer, L. (2017). TriviaQA: A large scale distantly supervised challenge dataset for reading comprehension. In</w:t>
       </w:r>
       <w:r>
         <w:t xml:space="preserve"> </w:t>
@@ -4868,7 +4852,7 @@
           <w:i/>
           <w:iCs/>
         </w:rPr>
-        <w:t xml:space="preserve">ICML</w:t>
+        <w:t xml:space="preserve">ACL</w:t>
       </w:r>
       <w:r>
         <w:t xml:space="preserve">.</w:t>
@@ -4879,7 +4863,15 @@
         <w:pStyle w:val="BodyText"/>
       </w:pPr>
       <w:r>
-        <w:t xml:space="preserve">[17] Kapoor, S., et al. (2024). Large language models must be taught to know what they don’t know. In</w:t>
+        <w:t xml:space="preserve">[15] Kadavath, S., et al. (2022). Language models (mostly) know what they know. arXiv:2207.05221.</w:t>
+      </w:r>
+    </w:p>
+    <w:p>
+      <w:pPr>
+        <w:pStyle w:val="BodyText"/>
+      </w:pPr>
+      <w:r>
+        <w:t xml:space="preserve">[16] Kandpal, N., Deng, H., Roberts, A., Wallace, E., &amp; Raffel, C. (2023). Large language models struggle to learn long-tail knowledge. In</w:t>
       </w:r>
       <w:r>
         <w:t xml:space="preserve"> </w:t>
@@ -4889,7 +4881,7 @@
           <w:i/>
           <w:iCs/>
         </w:rPr>
-        <w:t xml:space="preserve">NeurIPS</w:t>
+        <w:t xml:space="preserve">ICML</w:t>
       </w:r>
       <w:r>
         <w:t xml:space="preserve">.</w:t>
@@ -4900,15 +4892,7 @@
         <w:pStyle w:val="BodyText"/>
       </w:pPr>
       <w:r>
-        <w:t xml:space="preserve">[18] Kossen, J., et al. (2024). Semantic entropy probes: Robust and cheap hallucination detection in LLMs. arXiv:2406.15927.</w:t>
-      </w:r>
-    </w:p>
-    <w:p>
-      <w:pPr>
-        <w:pStyle w:val="BodyText"/>
-      </w:pPr>
-      <w:r>
-        <w:t xml:space="preserve">[19] Kuhn, L., Gal, Y., &amp; Farquhar, S. (2023). Semantic uncertainty: Linguistic invariances for uncertainty estimation in natural language generation. In</w:t>
+        <w:t xml:space="preserve">[17] Kapoor, S., et al. (2024). Large language models must be taught to know what they don’t know. In</w:t>
       </w:r>
       <w:r>
         <w:t xml:space="preserve"> </w:t>
@@ -4918,7 +4902,7 @@
           <w:i/>
           <w:iCs/>
         </w:rPr>
-        <w:t xml:space="preserve">ICLR</w:t>
+        <w:t xml:space="preserve">NeurIPS</w:t>
       </w:r>
       <w:r>
         <w:t xml:space="preserve">.</w:t>
@@ -4929,7 +4913,15 @@
         <w:pStyle w:val="BodyText"/>
       </w:pPr>
       <w:r>
-        <w:t xml:space="preserve">[20] Kwiatkowski, T., et al. (2019). Natural Questions: A benchmark for question answering research.</w:t>
+        <w:t xml:space="preserve">[18] Kossen, J., et al. (2024). Semantic entropy probes: Robust and cheap hallucination detection in LLMs. arXiv:2406.15927.</w:t>
+      </w:r>
+    </w:p>
+    <w:p>
+      <w:pPr>
+        <w:pStyle w:val="BodyText"/>
+      </w:pPr>
+      <w:r>
+        <w:t xml:space="preserve">[19] Kuhn, L., Gal, Y., &amp; Farquhar, S. (2023). Semantic uncertainty: Linguistic invariances for uncertainty estimation in natural language generation. In</w:t>
       </w:r>
       <w:r>
         <w:t xml:space="preserve"> </w:t>
@@ -4939,10 +4931,10 @@
           <w:i/>
           <w:iCs/>
         </w:rPr>
-        <w:t xml:space="preserve">Transactions of the Association for Computational Linguistics</w:t>
-      </w:r>
-      <w:r>
-        <w:t xml:space="preserve">, 7, 453-466.</w:t>
+        <w:t xml:space="preserve">ICLR</w:t>
+      </w:r>
+      <w:r>
+        <w:t xml:space="preserve">.</w:t>
       </w:r>
     </w:p>
     <w:p>
@@ -4950,7 +4942,7 @@
         <w:pStyle w:val="BodyText"/>
       </w:pPr>
       <w:r>
-        <w:t xml:space="preserve">[21] Lakshminarayanan, B., Pritzel, A., &amp; Blundell, C. (2017). Simple and scalable predictive uncertainty estimation using deep ensembles. In</w:t>
+        <w:t xml:space="preserve">[20] Kwiatkowski, T., et al. (2019). Natural Questions: A benchmark for question answering research.</w:t>
       </w:r>
       <w:r>
         <w:t xml:space="preserve"> </w:t>
@@ -4960,10 +4952,10 @@
           <w:i/>
           <w:iCs/>
         </w:rPr>
-        <w:t xml:space="preserve">NeurIPS</w:t>
-      </w:r>
-      <w:r>
-        <w:t xml:space="preserve">.</w:t>
+        <w:t xml:space="preserve">Transactions of the Association for Computational Linguistics</w:t>
+      </w:r>
+      <w:r>
+        <w:t xml:space="preserve">, 7, 453-466.</w:t>
       </w:r>
     </w:p>
     <w:p>
@@ -4971,7 +4963,7 @@
         <w:pStyle w:val="BodyText"/>
       </w:pPr>
       <w:r>
-        <w:t xml:space="preserve">[22] Lewis, P., et al. (2020). Retrieval-augmented generation for knowledge-intensive NLP tasks. In</w:t>
+        <w:t xml:space="preserve">[21] Lakshminarayanan, B., Pritzel, A., &amp; Blundell, C. (2017). Simple and scalable predictive uncertainty estimation using deep ensembles. In</w:t>
       </w:r>
       <w:r>
         <w:t xml:space="preserve"> </w:t>
@@ -4992,7 +4984,7 @@
         <w:pStyle w:val="BodyText"/>
       </w:pPr>
       <w:r>
-        <w:t xml:space="preserve">[23] Li, K., Patel, O., Viégas, F., Pfister, H., &amp; Wattenberg, M. (2023). Inference-time intervention: Eliciting truthful answers from a language model. In</w:t>
+        <w:t xml:space="preserve">[22] Lewis, P., et al. (2020). Retrieval-augmented generation for knowledge-intensive NLP tasks. In</w:t>
       </w:r>
       <w:r>
         <w:t xml:space="preserve"> </w:t>
@@ -5013,7 +5005,7 @@
         <w:pStyle w:val="BodyText"/>
       </w:pPr>
       <w:r>
-        <w:t xml:space="preserve">[24] Lin, S., Hilton, J., &amp; Evans, O. (2022). Teaching models to express their uncertainty in words.</w:t>
+        <w:t xml:space="preserve">[23] Li, K., Patel, O., Viégas, F., Pfister, H., &amp; Wattenberg, M. (2023). Inference-time intervention: Eliciting truthful answers from a language model. In</w:t>
       </w:r>
       <w:r>
         <w:t xml:space="preserve"> </w:t>
@@ -5023,7 +5015,7 @@
           <w:i/>
           <w:iCs/>
         </w:rPr>
-        <w:t xml:space="preserve">Transactions on Machine Learning Research</w:t>
+        <w:t xml:space="preserve">NeurIPS</w:t>
       </w:r>
       <w:r>
         <w:t xml:space="preserve">.</w:t>
@@ -5034,7 +5026,7 @@
         <w:pStyle w:val="BodyText"/>
       </w:pPr>
       <w:r>
-        <w:t xml:space="preserve">[25] Mallen, A., Asai, A., Zhong, V., Das, R., Khashabi, D., &amp; Hajishirzi, H. (2023). When not to trust language models: Investigating effectiveness of parametric and non-parametric memories. In</w:t>
+        <w:t xml:space="preserve">[24] Lin, S., Hilton, J., &amp; Evans, O. (2022). Teaching models to express their uncertainty in words.</w:t>
       </w:r>
       <w:r>
         <w:t xml:space="preserve"> </w:t>
@@ -5044,7 +5036,7 @@
           <w:i/>
           <w:iCs/>
         </w:rPr>
-        <w:t xml:space="preserve">ACL</w:t>
+        <w:t xml:space="preserve">Transactions on Machine Learning Research</w:t>
       </w:r>
       <w:r>
         <w:t xml:space="preserve">.</w:t>
@@ -5055,7 +5047,7 @@
         <w:pStyle w:val="BodyText"/>
       </w:pPr>
       <w:r>
-        <w:t xml:space="preserve">[26] Manakul, P., Liusie, A., &amp; Gales, M. J. F. (2023). SelfCheckGPT: Zero-resource black-box hallucination detection for generative large language models. In</w:t>
+        <w:t xml:space="preserve">[25] Mallen, A., Asai, A., Zhong, V., Das, R., Khashabi, D., &amp; Hajishirzi, H. (2023). When not to trust language models: Investigating effectiveness of parametric and non-parametric memories. In</w:t>
       </w:r>
       <w:r>
         <w:t xml:space="preserve"> </w:t>
@@ -5065,7 +5057,7 @@
           <w:i/>
           <w:iCs/>
         </w:rPr>
-        <w:t xml:space="preserve">EMNLP</w:t>
+        <w:t xml:space="preserve">ACL</w:t>
       </w:r>
       <w:r>
         <w:t xml:space="preserve">.</w:t>
@@ -5076,7 +5068,7 @@
         <w:pStyle w:val="BodyText"/>
       </w:pPr>
       <w:r>
-        <w:t xml:space="preserve">[27] Marks, S., &amp; Tegmark, M. (2024). The geometry of truth: Emergent linear structure in large language model representations of true/false datasets. In</w:t>
+        <w:t xml:space="preserve">[26] Manakul, P., Liusie, A., &amp; Gales, M. J. F. (2023). SelfCheckGPT: Zero-resource black-box hallucination detection for generative large language models. In</w:t>
       </w:r>
       <w:r>
         <w:t xml:space="preserve"> </w:t>
@@ -5086,7 +5078,7 @@
           <w:i/>
           <w:iCs/>
         </w:rPr>
-        <w:t xml:space="preserve">COLM</w:t>
+        <w:t xml:space="preserve">EMNLP</w:t>
       </w:r>
       <w:r>
         <w:t xml:space="preserve">.</w:t>
@@ -5097,7 +5089,7 @@
         <w:pStyle w:val="BodyText"/>
       </w:pPr>
       <w:r>
-        <w:t xml:space="preserve">[28] Maynez, J., Narayan, S., Bohnet, B., &amp; McDonald, R. (2020). On faithfulness and factuality in abstractive summarization. In</w:t>
+        <w:t xml:space="preserve">[27] Marks, S., &amp; Tegmark, M. (2024). The geometry of truth: Emergent linear structure in large language model representations of true/false datasets. In</w:t>
       </w:r>
       <w:r>
         <w:t xml:space="preserve"> </w:t>
@@ -5107,7 +5099,7 @@
           <w:i/>
           <w:iCs/>
         </w:rPr>
-        <w:t xml:space="preserve">ACL</w:t>
+        <w:t xml:space="preserve">COLM</w:t>
       </w:r>
       <w:r>
         <w:t xml:space="preserve">.</w:t>
@@ -5118,7 +5110,7 @@
         <w:pStyle w:val="BodyText"/>
       </w:pPr>
       <w:r>
-        <w:t xml:space="preserve">[29] Mielke, S. J., Szlam, A., Dinan, E., &amp; Boureau, Y.-L. (2022). Reducing conversational agents’ overconfidence through linguistic calibration.</w:t>
+        <w:t xml:space="preserve">[28] Maynez, J., Narayan, S., Bohnet, B., &amp; McDonald, R. (2020). On faithfulness and factuality in abstractive summarization. In</w:t>
       </w:r>
       <w:r>
         <w:t xml:space="preserve"> </w:t>
@@ -5128,10 +5120,10 @@
           <w:i/>
           <w:iCs/>
         </w:rPr>
-        <w:t xml:space="preserve">Transactions of the Association for Computational Linguistics</w:t>
-      </w:r>
-      <w:r>
-        <w:t xml:space="preserve">, 10, 857-872.</w:t>
+        <w:t xml:space="preserve">ACL</w:t>
+      </w:r>
+      <w:r>
+        <w:t xml:space="preserve">.</w:t>
       </w:r>
     </w:p>
     <w:p>
@@ -5139,7 +5131,7 @@
         <w:pStyle w:val="BodyText"/>
       </w:pPr>
       <w:r>
-        <w:t xml:space="preserve">[30] Min, S., et al. (2023). FActScore: Fine-grained atomic evaluation of factual precision in long form text generation. In</w:t>
+        <w:t xml:space="preserve">[29] Mielke, S. J., Szlam, A., Dinan, E., &amp; Boureau, Y.-L. (2022). Reducing conversational agents’ overconfidence through linguistic calibration.</w:t>
       </w:r>
       <w:r>
         <w:t xml:space="preserve"> </w:t>
@@ -5149,10 +5141,10 @@
           <w:i/>
           <w:iCs/>
         </w:rPr>
-        <w:t xml:space="preserve">EMNLP</w:t>
-      </w:r>
-      <w:r>
-        <w:t xml:space="preserve">.</w:t>
+        <w:t xml:space="preserve">Transactions of the Association for Computational Linguistics</w:t>
+      </w:r>
+      <w:r>
+        <w:t xml:space="preserve">, 10, 857-872.</w:t>
       </w:r>
     </w:p>
     <w:p>
@@ -5160,7 +5152,7 @@
         <w:pStyle w:val="BodyText"/>
       </w:pPr>
       <w:r>
-        <w:t xml:space="preserve">[31] Orgad, H., et al. (2025). LLMs know more than they show: On the intrinsic representation of LLM hallucinations. In</w:t>
+        <w:t xml:space="preserve">[30] Min, S., et al. (2023). FActScore: Fine-grained atomic evaluation of factual precision in long form text generation. In</w:t>
       </w:r>
       <w:r>
         <w:t xml:space="preserve"> </w:t>
@@ -5170,7 +5162,7 @@
           <w:i/>
           <w:iCs/>
         </w:rPr>
-        <w:t xml:space="preserve">ICLR</w:t>
+        <w:t xml:space="preserve">EMNLP</w:t>
       </w:r>
       <w:r>
         <w:t xml:space="preserve">.</w:t>
@@ -5181,7 +5173,7 @@
         <w:pStyle w:val="BodyText"/>
       </w:pPr>
       <w:r>
-        <w:t xml:space="preserve">[32] Ouyang, L., et al. (2022). Training language models to follow instructions with human feedback. In</w:t>
+        <w:t xml:space="preserve">[31] Orgad, H., et al. (2025). LLMs know more than they show: On the intrinsic representation of LLM hallucinations. In</w:t>
       </w:r>
       <w:r>
         <w:t xml:space="preserve"> </w:t>
@@ -5191,7 +5183,7 @@
           <w:i/>
           <w:iCs/>
         </w:rPr>
-        <w:t xml:space="preserve">NeurIPS</w:t>
+        <w:t xml:space="preserve">ICLR</w:t>
       </w:r>
       <w:r>
         <w:t xml:space="preserve">.</w:t>
@@ -5202,7 +5194,7 @@
         <w:pStyle w:val="BodyText"/>
       </w:pPr>
       <w:r>
-        <w:t xml:space="preserve">[33] Platt, J. (1999). Probabilistic outputs for support vector machines and comparisons to regularized likelihood methods. In</w:t>
+        <w:t xml:space="preserve">[32] Ouyang, L., et al. (2022). Training language models to follow instructions with human feedback. In</w:t>
       </w:r>
       <w:r>
         <w:t xml:space="preserve"> </w:t>
@@ -5212,7 +5204,7 @@
           <w:i/>
           <w:iCs/>
         </w:rPr>
-        <w:t xml:space="preserve">Advances in Large Margin Classifiers</w:t>
+        <w:t xml:space="preserve">NeurIPS</w:t>
       </w:r>
       <w:r>
         <w:t xml:space="preserve">.</w:t>
@@ -5223,7 +5215,7 @@
         <w:pStyle w:val="BodyText"/>
       </w:pPr>
       <w:r>
-        <w:t xml:space="preserve">[34] Rajpurkar, P., Jia, R., &amp; Liang, P. (2018). Know what you don’t know: Unanswerable questions for SQuAD. In</w:t>
+        <w:t xml:space="preserve">[33] Platt, J. (1999). Probabilistic outputs for support vector machines and comparisons to regularized likelihood methods. In</w:t>
       </w:r>
       <w:r>
         <w:t xml:space="preserve"> </w:t>
@@ -5233,7 +5225,7 @@
           <w:i/>
           <w:iCs/>
         </w:rPr>
-        <w:t xml:space="preserve">ACL</w:t>
+        <w:t xml:space="preserve">Advances in Large Margin Classifiers</w:t>
       </w:r>
       <w:r>
         <w:t xml:space="preserve">.</w:t>
@@ -5244,7 +5236,7 @@
         <w:pStyle w:val="BodyText"/>
       </w:pPr>
       <w:r>
-        <w:t xml:space="preserve">[35] Rajpurkar, P., Zhang, J., Lopyrev, K., &amp; Liang, P. (2016). SQuAD: 100,000+ questions for machine comprehension of text. In</w:t>
+        <w:t xml:space="preserve">[34] Rajpurkar, P., Jia, R., &amp; Liang, P. (2018). Know what you don’t know: Unanswerable questions for SQuAD. In</w:t>
       </w:r>
       <w:r>
         <w:t xml:space="preserve"> </w:t>
@@ -5254,7 +5246,7 @@
           <w:i/>
           <w:iCs/>
         </w:rPr>
-        <w:t xml:space="preserve">EMNLP</w:t>
+        <w:t xml:space="preserve">ACL</w:t>
       </w:r>
       <w:r>
         <w:t xml:space="preserve">.</w:t>
@@ -5265,7 +5257,7 @@
         <w:pStyle w:val="BodyText"/>
       </w:pPr>
       <w:r>
-        <w:t xml:space="preserve">[36] Shafer, G., &amp; Vovk, V. (2008). A tutorial on conformal prediction.</w:t>
+        <w:t xml:space="preserve">[35] Rajpurkar, P., Zhang, J., Lopyrev, K., &amp; Liang, P. (2016). SQuAD: 100,000+ questions for machine comprehension of text. In</w:t>
       </w:r>
       <w:r>
         <w:t xml:space="preserve"> </w:t>
@@ -5275,10 +5267,10 @@
           <w:i/>
           <w:iCs/>
         </w:rPr>
-        <w:t xml:space="preserve">Journal of Machine Learning Research</w:t>
-      </w:r>
-      <w:r>
-        <w:t xml:space="preserve">, 9, 371-421.</w:t>
+        <w:t xml:space="preserve">EMNLP</w:t>
+      </w:r>
+      <w:r>
+        <w:t xml:space="preserve">.</w:t>
       </w:r>
     </w:p>
     <w:p>
@@ -5286,7 +5278,7 @@
         <w:pStyle w:val="BodyText"/>
       </w:pPr>
       <w:r>
-        <w:t xml:space="preserve">[37] Tian, K., et al. (2023). Just ask for calibration: Strategies for eliciting calibrated confidence scores from language models fine-tuned with human feedback. In</w:t>
+        <w:t xml:space="preserve">[36] Shafer, G., &amp; Vovk, V. (2008). A tutorial on conformal prediction.</w:t>
       </w:r>
       <w:r>
         <w:t xml:space="preserve"> </w:t>
@@ -5296,10 +5288,10 @@
           <w:i/>
           <w:iCs/>
         </w:rPr>
-        <w:t xml:space="preserve">EMNLP</w:t>
-      </w:r>
-      <w:r>
-        <w:t xml:space="preserve">.</w:t>
+        <w:t xml:space="preserve">Journal of Machine Learning Research</w:t>
+      </w:r>
+      <w:r>
+        <w:t xml:space="preserve">, 9, 371-421.</w:t>
       </w:r>
     </w:p>
     <w:p>
@@ -5307,7 +5299,7 @@
         <w:pStyle w:val="BodyText"/>
       </w:pPr>
       <w:r>
-        <w:t xml:space="preserve">[38] Zadrozny, B., &amp; Elkan, C. (2002). Transforming classifier scores into accurate multiclass probability estimates. In</w:t>
+        <w:t xml:space="preserve">[37] Tian, K., et al. (2023). Just ask for calibration: Strategies for eliciting calibrated confidence scores from language models fine-tuned with human feedback. In</w:t>
       </w:r>
       <w:r>
         <w:t xml:space="preserve"> </w:t>
@@ -5317,7 +5309,7 @@
           <w:i/>
           <w:iCs/>
         </w:rPr>
-        <w:t xml:space="preserve">KDD</w:t>
+        <w:t xml:space="preserve">EMNLP</w:t>
       </w:r>
       <w:r>
         <w:t xml:space="preserve">.</w:t>
@@ -5328,7 +5320,7 @@
         <w:pStyle w:val="BodyText"/>
       </w:pPr>
       <w:r>
-        <w:t xml:space="preserve">[39] Zhao, T. Z., Wallace, E., Feng, S., Klein, D., &amp; Singh, S. (2021). Calibrate before use: Improving few-shot performance of language models. In</w:t>
+        <w:t xml:space="preserve">[38] Zadrozny, B., &amp; Elkan, C. (2002). Transforming classifier scores into accurate multiclass probability estimates. In</w:t>
       </w:r>
       <w:r>
         <w:t xml:space="preserve"> </w:t>
@@ -5338,10 +5330,31 @@
           <w:i/>
           <w:iCs/>
         </w:rPr>
+        <w:t xml:space="preserve">KDD</w:t>
+      </w:r>
+      <w:r>
+        <w:t xml:space="preserve">.</w:t>
+      </w:r>
+    </w:p>
+    <w:p>
+      <w:pPr>
+        <w:pStyle w:val="BodyText"/>
+      </w:pPr>
+      <w:r>
+        <w:t xml:space="preserve">[39] Zhao, Z., Wallace, E., Feng, S., Klein, D., &amp; Singh, S. (2021). Calibrate before use: Improving few-shot performance of language models. In</w:t>
+      </w:r>
+      <w:r>
+        <w:t xml:space="preserve"> </w:t>
+      </w:r>
+      <w:r>
+        <w:rPr>
+          <w:i/>
+          <w:iCs/>
+        </w:rPr>
         <w:t xml:space="preserve">ICML</w:t>
       </w:r>
       <w:r>
-        <w:t xml:space="preserve">.</w:t>
+        <w:t xml:space="preserve">, PMLR 139, 12697-12706.</w:t>
       </w:r>
     </w:p>
     <w:bookmarkEnd w:id="45"/>

</xml_diff>